<commit_message>
Remove school from education and add clickable profile links
Drop Class XII from Education and make email, LinkedIn, and GitHub
clickable hyperlinks in both the PDF and DOCX resumes.

Co-authored-by: Anannya Rai Paul <anannyarp12@users.noreply.github.com>
</commit_message>
<xml_diff>
--- a/Ananya_Rai_Paul_Data_Analyst_Resume.docx
+++ b/Ananya_Rai_Paul_Data_Analyst_Resume.docx
@@ -25,6 +25,17 @@
           <w:bottom w:val="single" w:sz="12" w:space="1" w:color="1A1A2E"/>
         </w:pBdr>
       </w:pPr>
+      <w:hyperlink r:id="rId9">
+        <w:r>
+          <w:rPr>
+            <w:color w:val="333333"/>
+            <w:u w:val="single"/>
+            <w:sz w:val="20"/>
+            <w:rFonts w:ascii="Calibri" w:hAnsi="Calibri"/>
+          </w:rPr>
+          <w:t>anannyaraipaul@gmail.com</w:t>
+        </w:r>
+      </w:hyperlink>
       <w:r>
         <w:rPr>
           <w:rFonts w:ascii="Calibri" w:hAnsi="Calibri" w:eastAsia="Calibri"/>
@@ -32,8 +43,39 @@
           <w:color w:val="333333"/>
           <w:sz w:val="20"/>
         </w:rPr>
-        <w:t>anannyaraipaul@gmail.com | linkedin.com/in/annyarp | github.com/anannyarp12</w:t>
+        <w:t xml:space="preserve"> | </w:t>
       </w:r>
+      <w:hyperlink r:id="rId10">
+        <w:r>
+          <w:rPr>
+            <w:color w:val="2563EB"/>
+            <w:u w:val="single"/>
+            <w:sz w:val="20"/>
+            <w:rFonts w:ascii="Calibri" w:hAnsi="Calibri"/>
+          </w:rPr>
+          <w:t>linkedin.com/in/annyarp</w:t>
+        </w:r>
+      </w:hyperlink>
+      <w:r>
+        <w:rPr>
+          <w:rFonts w:ascii="Calibri" w:hAnsi="Calibri" w:eastAsia="Calibri"/>
+          <w:b w:val="0"/>
+          <w:color w:val="333333"/>
+          <w:sz w:val="20"/>
+        </w:rPr>
+        <w:t xml:space="preserve"> | </w:t>
+      </w:r>
+      <w:hyperlink r:id="rId11">
+        <w:r>
+          <w:rPr>
+            <w:color w:val="2563EB"/>
+            <w:u w:val="single"/>
+            <w:sz w:val="20"/>
+            <w:rFonts w:ascii="Calibri" w:hAnsi="Calibri"/>
+          </w:rPr>
+          <w:t>github.com/anannyarp12</w:t>
+        </w:r>
+      </w:hyperlink>
     </w:p>
     <w:p>
       <w:pPr>
@@ -505,34 +547,6 @@
     </w:p>
     <w:p>
       <w:pPr>
-        <w:spacing w:before="80" w:after="20"/>
-      </w:pPr>
-      <w:r>
-        <w:rPr>
-          <w:rFonts w:ascii="Calibri" w:hAnsi="Calibri" w:eastAsia="Calibri"/>
-          <w:b/>
-          <w:color w:val="000000"/>
-          <w:sz w:val="20"/>
-        </w:rPr>
-        <w:t>St. Joseph's High School — ISC Class XII (2021)</w:t>
-      </w:r>
-    </w:p>
-    <w:p>
-      <w:pPr>
-        <w:spacing w:after="60"/>
-      </w:pPr>
-      <w:r>
-        <w:rPr>
-          <w:rFonts w:ascii="Calibri" w:hAnsi="Calibri" w:eastAsia="Calibri"/>
-          <w:b w:val="0"/>
-          <w:color w:val="333333"/>
-          <w:sz w:val="20"/>
-        </w:rPr>
-        <w:t>English, Mathematics, Physics, Chemistry | Percentage: 74%</w:t>
-      </w:r>
-    </w:p>
-    <w:p>
-      <w:pPr>
         <w:spacing w:before="200" w:after="40"/>
         <w:pBdr>
           <w:bottom w:val="single" w:sz="12" w:space="1" w:color="1A1A2E"/>

</xml_diff>